<commit_message>
feat: week3 assignment added
</commit_message>
<xml_diff>
--- a/week3/IT3240_Week_3/Week 3 Assignment.docx
+++ b/week3/IT3240_Week_3/Week 3 Assignment.docx
@@ -221,7 +221,7 @@
     </w:p>
     <w:p>
       <w:pPr>
-        <w:spacing w:line="480" w:lineRule="auto"/>
+        <w:spacing w:line="276" w:lineRule="auto"/>
         <w:ind w:firstLine="720"/>
         <w:rPr>
           <w:rFonts w:ascii="Times New Roman" w:hAnsi="Times New Roman" w:cs="Times New Roman"/>
@@ -231,67 +231,7 @@
         <w:rPr>
           <w:rFonts w:ascii="Times New Roman" w:hAnsi="Times New Roman" w:cs="Times New Roman"/>
         </w:rPr>
-        <w:t>The index.html</w:t>
-      </w:r>
-      <w:r>
-        <w:rPr>
-          <w:rFonts w:ascii="Times New Roman" w:hAnsi="Times New Roman" w:cs="Times New Roman"/>
-        </w:rPr>
-        <w:t>, about.html, and contact.html</w:t>
-      </w:r>
-      <w:r>
-        <w:rPr>
-          <w:rFonts w:ascii="Times New Roman" w:hAnsi="Times New Roman" w:cs="Times New Roman"/>
-        </w:rPr>
-        <w:t xml:space="preserve"> file</w:t>
-      </w:r>
-      <w:r>
-        <w:rPr>
-          <w:rFonts w:ascii="Times New Roman" w:hAnsi="Times New Roman" w:cs="Times New Roman"/>
-        </w:rPr>
-        <w:t>(s)</w:t>
-      </w:r>
-      <w:r>
-        <w:rPr>
-          <w:rFonts w:ascii="Times New Roman" w:hAnsi="Times New Roman" w:cs="Times New Roman"/>
-        </w:rPr>
-        <w:t xml:space="preserve"> </w:t>
-      </w:r>
-      <w:r>
-        <w:rPr>
-          <w:rFonts w:ascii="Times New Roman" w:hAnsi="Times New Roman" w:cs="Times New Roman"/>
-        </w:rPr>
-        <w:t>were</w:t>
-      </w:r>
-      <w:r>
-        <w:rPr>
-          <w:rFonts w:ascii="Times New Roman" w:hAnsi="Times New Roman" w:cs="Times New Roman"/>
-        </w:rPr>
-        <w:t xml:space="preserve"> tested in two browsers to verify correct rendering: Google</w:t>
-      </w:r>
-      <w:r>
-        <w:rPr>
-          <w:rFonts w:ascii="Times New Roman" w:hAnsi="Times New Roman" w:cs="Times New Roman"/>
-        </w:rPr>
-        <w:t xml:space="preserve"> </w:t>
-      </w:r>
-      <w:r>
-        <w:rPr>
-          <w:rFonts w:ascii="Times New Roman" w:hAnsi="Times New Roman" w:cs="Times New Roman"/>
-        </w:rPr>
-        <w:t>Chrome and Mozilla Firefox. Both browsers displayed the page</w:t>
-      </w:r>
-      <w:r>
-        <w:rPr>
-          <w:rFonts w:ascii="Times New Roman" w:hAnsi="Times New Roman" w:cs="Times New Roman"/>
-        </w:rPr>
-        <w:t>(s)</w:t>
-      </w:r>
-      <w:r>
-        <w:rPr>
-          <w:rFonts w:ascii="Times New Roman" w:hAnsi="Times New Roman" w:cs="Times New Roman"/>
-        </w:rPr>
-        <w:t xml:space="preserve"> as expected, with all headings, images, and paragraph text rendering correctly.</w:t>
+        <w:t>The index.html, about.html, and contact.html file(s) were tested in two browsers to verify correct rendering: Google Chrome and Mozilla Firefox. Both browsers displayed the page(s) as expected, with all headings, images, paragraph text, and CSS styling rendering correctly.</w:t>
       </w:r>
     </w:p>
     <w:p>
@@ -308,10 +248,10 @@
           <w:noProof/>
         </w:rPr>
         <w:drawing>
-          <wp:inline distT="0" distB="0" distL="0" distR="0" wp14:anchorId="5DC88E04" wp14:editId="3A84FF6F">
-            <wp:extent cx="2762865" cy="1743616"/>
-            <wp:effectExtent l="0" t="0" r="0" b="0"/>
-            <wp:docPr id="1632584977" name="Picture 1"/>
+          <wp:inline distT="0" distB="0" distL="0" distR="0" wp14:anchorId="0F1C4640" wp14:editId="2050EF99">
+            <wp:extent cx="3225022" cy="2035278"/>
+            <wp:effectExtent l="0" t="0" r="1270" b="0"/>
+            <wp:docPr id="372631928" name="Picture 1"/>
             <wp:cNvGraphicFramePr>
               <a:graphicFrameLocks xmlns:a="http://schemas.openxmlformats.org/drawingml/2006/main" noChangeAspect="1"/>
             </wp:cNvGraphicFramePr>
@@ -319,7 +259,7 @@
               <a:graphicData uri="http://schemas.openxmlformats.org/drawingml/2006/picture">
                 <pic:pic xmlns:pic="http://schemas.openxmlformats.org/drawingml/2006/picture">
                   <pic:nvPicPr>
-                    <pic:cNvPr id="1632584977" name="Picture 1"/>
+                    <pic:cNvPr id="372631928" name="Picture 372631928"/>
                     <pic:cNvPicPr/>
                   </pic:nvPicPr>
                   <pic:blipFill>
@@ -337,7 +277,7 @@
                   <pic:spPr>
                     <a:xfrm>
                       <a:off x="0" y="0"/>
-                      <a:ext cx="2869163" cy="1810700"/>
+                      <a:ext cx="3356143" cy="2118027"/>
                     </a:xfrm>
                     <a:prstGeom prst="rect">
                       <a:avLst/>
@@ -353,7 +293,13 @@
         <w:rPr>
           <w:rFonts w:ascii="Times New Roman" w:hAnsi="Times New Roman" w:cs="Times New Roman"/>
         </w:rPr>
-        <w:t>(1.</w:t>
+        <w:t>(</w:t>
+      </w:r>
+      <w:r>
+        <w:rPr>
+          <w:rFonts w:ascii="Times New Roman" w:hAnsi="Times New Roman" w:cs="Times New Roman"/>
+        </w:rPr>
+        <w:t>1.</w:t>
       </w:r>
       <w:proofErr w:type="spellStart"/>
       <w:r>
@@ -369,25 +315,16 @@
         </w:rPr>
         <w:t xml:space="preserve"> index.html)</w:t>
       </w:r>
-    </w:p>
-    <w:p>
-      <w:pPr>
-        <w:spacing w:line="276" w:lineRule="auto"/>
-        <w:jc w:val="center"/>
-        <w:rPr>
-          <w:rFonts w:ascii="Times New Roman" w:hAnsi="Times New Roman" w:cs="Times New Roman"/>
-        </w:rPr>
-      </w:pPr>
       <w:r>
         <w:rPr>
           <w:rFonts w:ascii="Times New Roman" w:hAnsi="Times New Roman" w:cs="Times New Roman"/>
           <w:noProof/>
         </w:rPr>
         <w:drawing>
-          <wp:inline distT="0" distB="0" distL="0" distR="0" wp14:anchorId="0E979EE7" wp14:editId="69B7B78B">
-            <wp:extent cx="2819947" cy="1779639"/>
-            <wp:effectExtent l="0" t="0" r="0" b="0"/>
-            <wp:docPr id="1415248270" name="Picture 2"/>
+          <wp:inline distT="0" distB="0" distL="0" distR="0" wp14:anchorId="49A3851C" wp14:editId="45D1E527">
+            <wp:extent cx="3209442" cy="2025445"/>
+            <wp:effectExtent l="0" t="0" r="3810" b="0"/>
+            <wp:docPr id="1974485903" name="Picture 2"/>
             <wp:cNvGraphicFramePr>
               <a:graphicFrameLocks xmlns:a="http://schemas.openxmlformats.org/drawingml/2006/main" noChangeAspect="1"/>
             </wp:cNvGraphicFramePr>
@@ -395,7 +332,7 @@
               <a:graphicData uri="http://schemas.openxmlformats.org/drawingml/2006/picture">
                 <pic:pic xmlns:pic="http://schemas.openxmlformats.org/drawingml/2006/picture">
                   <pic:nvPicPr>
-                    <pic:cNvPr id="1415248270" name="Picture 2"/>
+                    <pic:cNvPr id="1974485903" name="Picture 1974485903"/>
                     <pic:cNvPicPr/>
                   </pic:nvPicPr>
                   <pic:blipFill>
@@ -413,7 +350,7 @@
                   <pic:spPr>
                     <a:xfrm>
                       <a:off x="0" y="0"/>
-                      <a:ext cx="2993584" cy="1889220"/>
+                      <a:ext cx="3376481" cy="2130861"/>
                     </a:xfrm>
                     <a:prstGeom prst="rect">
                       <a:avLst/>
@@ -429,33 +366,24 @@
         <w:rPr>
           <w:rFonts w:ascii="Times New Roman" w:hAnsi="Times New Roman" w:cs="Times New Roman"/>
         </w:rPr>
-        <w:t>(1</w:t>
-      </w:r>
-      <w:r>
-        <w:rPr>
-          <w:rFonts w:ascii="Times New Roman" w:hAnsi="Times New Roman" w:cs="Times New Roman"/>
-        </w:rPr>
-        <w:t>.b about.html)</w:t>
-      </w:r>
-    </w:p>
-    <w:p>
-      <w:pPr>
-        <w:spacing w:line="276" w:lineRule="auto"/>
-        <w:jc w:val="center"/>
-        <w:rPr>
-          <w:rFonts w:ascii="Times New Roman" w:hAnsi="Times New Roman" w:cs="Times New Roman"/>
-        </w:rPr>
-      </w:pPr>
+        <w:t>(</w:t>
+      </w:r>
+      <w:r>
+        <w:rPr>
+          <w:rFonts w:ascii="Times New Roman" w:hAnsi="Times New Roman" w:cs="Times New Roman"/>
+        </w:rPr>
+        <w:t>1.b about.html)</w:t>
+      </w:r>
       <w:r>
         <w:rPr>
           <w:rFonts w:ascii="Times New Roman" w:hAnsi="Times New Roman" w:cs="Times New Roman"/>
           <w:noProof/>
         </w:rPr>
         <w:drawing>
-          <wp:inline distT="0" distB="0" distL="0" distR="0" wp14:anchorId="0FCC7E73" wp14:editId="7AE0A95A">
-            <wp:extent cx="2882266" cy="1818968"/>
-            <wp:effectExtent l="0" t="0" r="635" b="0"/>
-            <wp:docPr id="345630593" name="Picture 3"/>
+          <wp:inline distT="0" distB="0" distL="0" distR="0" wp14:anchorId="7E8C56CD" wp14:editId="77099624">
+            <wp:extent cx="3234813" cy="2041457"/>
+            <wp:effectExtent l="0" t="0" r="3810" b="3810"/>
+            <wp:docPr id="792328866" name="Picture 3"/>
             <wp:cNvGraphicFramePr>
               <a:graphicFrameLocks xmlns:a="http://schemas.openxmlformats.org/drawingml/2006/main" noChangeAspect="1"/>
             </wp:cNvGraphicFramePr>
@@ -463,7 +391,7 @@
               <a:graphicData uri="http://schemas.openxmlformats.org/drawingml/2006/picture">
                 <pic:pic xmlns:pic="http://schemas.openxmlformats.org/drawingml/2006/picture">
                   <pic:nvPicPr>
-                    <pic:cNvPr id="345630593" name="Picture 3"/>
+                    <pic:cNvPr id="792328866" name="Picture 792328866"/>
                     <pic:cNvPicPr/>
                   </pic:nvPicPr>
                   <pic:blipFill>
@@ -481,7 +409,7 @@
                   <pic:spPr>
                     <a:xfrm>
                       <a:off x="0" y="0"/>
-                      <a:ext cx="2892216" cy="1825247"/>
+                      <a:ext cx="3318775" cy="2094445"/>
                     </a:xfrm>
                     <a:prstGeom prst="rect">
                       <a:avLst/>
@@ -497,7 +425,13 @@
         <w:rPr>
           <w:rFonts w:ascii="Times New Roman" w:hAnsi="Times New Roman" w:cs="Times New Roman"/>
         </w:rPr>
-        <w:t>(1.c contact.html)</w:t>
+        <w:t>(1.c</w:t>
+      </w:r>
+      <w:r>
+        <w:rPr>
+          <w:rFonts w:ascii="Times New Roman" w:hAnsi="Times New Roman" w:cs="Times New Roman"/>
+        </w:rPr>
+        <w:t xml:space="preserve"> contact.html)</w:t>
       </w:r>
     </w:p>
     <w:p>
@@ -559,7 +493,7 @@
     </w:p>
     <w:p>
       <w:pPr>
-        <w:spacing w:after="0" w:line="276" w:lineRule="auto"/>
+        <w:spacing w:line="276" w:lineRule="auto"/>
         <w:jc w:val="center"/>
         <w:rPr>
           <w:rFonts w:ascii="Times New Roman" w:hAnsi="Times New Roman" w:cs="Times New Roman"/>
@@ -572,10 +506,10 @@
         </w:rPr>
         <w:lastRenderedPageBreak/>
         <w:drawing>
-          <wp:inline distT="0" distB="0" distL="0" distR="0" wp14:anchorId="4BD5E8DA" wp14:editId="56E78A49">
-            <wp:extent cx="3392129" cy="2140738"/>
-            <wp:effectExtent l="0" t="0" r="0" b="5715"/>
-            <wp:docPr id="1003186076" name="Picture 2"/>
+          <wp:inline distT="0" distB="0" distL="0" distR="0" wp14:anchorId="0ADD257D" wp14:editId="1C4322A0">
+            <wp:extent cx="3254477" cy="2053867"/>
+            <wp:effectExtent l="0" t="0" r="0" b="3810"/>
+            <wp:docPr id="1081027473" name="Picture 4"/>
             <wp:cNvGraphicFramePr>
               <a:graphicFrameLocks xmlns:a="http://schemas.openxmlformats.org/drawingml/2006/main" noChangeAspect="1"/>
             </wp:cNvGraphicFramePr>
@@ -583,7 +517,7 @@
               <a:graphicData uri="http://schemas.openxmlformats.org/drawingml/2006/picture">
                 <pic:pic xmlns:pic="http://schemas.openxmlformats.org/drawingml/2006/picture">
                   <pic:nvPicPr>
-                    <pic:cNvPr id="1003186076" name="Picture 1003186076"/>
+                    <pic:cNvPr id="1081027473" name="Picture 1081027473"/>
                     <pic:cNvPicPr/>
                   </pic:nvPicPr>
                   <pic:blipFill>
@@ -601,7 +535,7 @@
                   <pic:spPr>
                     <a:xfrm>
                       <a:off x="0" y="0"/>
-                      <a:ext cx="3460060" cy="2183608"/>
+                      <a:ext cx="3309388" cy="2088521"/>
                     </a:xfrm>
                     <a:prstGeom prst="rect">
                       <a:avLst/>
@@ -639,10 +573,10 @@
           <w:noProof/>
         </w:rPr>
         <w:drawing>
-          <wp:inline distT="0" distB="0" distL="0" distR="0" wp14:anchorId="38077567" wp14:editId="116B27EE">
-            <wp:extent cx="3382297" cy="2134531"/>
-            <wp:effectExtent l="0" t="0" r="0" b="0"/>
-            <wp:docPr id="466164371" name="Picture 1"/>
+          <wp:inline distT="0" distB="0" distL="0" distR="0" wp14:anchorId="47A8FFC9" wp14:editId="44917BB2">
+            <wp:extent cx="3274142" cy="2066277"/>
+            <wp:effectExtent l="0" t="0" r="2540" b="4445"/>
+            <wp:docPr id="1990041460" name="Picture 5"/>
             <wp:cNvGraphicFramePr>
               <a:graphicFrameLocks xmlns:a="http://schemas.openxmlformats.org/drawingml/2006/main" noChangeAspect="1"/>
             </wp:cNvGraphicFramePr>
@@ -650,7 +584,7 @@
               <a:graphicData uri="http://schemas.openxmlformats.org/drawingml/2006/picture">
                 <pic:pic xmlns:pic="http://schemas.openxmlformats.org/drawingml/2006/picture">
                   <pic:nvPicPr>
-                    <pic:cNvPr id="466164371" name="Picture 466164371"/>
+                    <pic:cNvPr id="1990041460" name="Picture 1990041460"/>
                     <pic:cNvPicPr/>
                   </pic:nvPicPr>
                   <pic:blipFill>
@@ -668,7 +602,7 @@
                   <pic:spPr>
                     <a:xfrm>
                       <a:off x="0" y="0"/>
-                      <a:ext cx="3500775" cy="2209301"/>
+                      <a:ext cx="3330576" cy="2101892"/>
                     </a:xfrm>
                     <a:prstGeom prst="rect">
                       <a:avLst/>
@@ -692,10 +626,10 @@
           <w:noProof/>
         </w:rPr>
         <w:drawing>
-          <wp:inline distT="0" distB="0" distL="0" distR="0" wp14:anchorId="2D478153" wp14:editId="66CE3F9C">
-            <wp:extent cx="3254477" cy="2053867"/>
-            <wp:effectExtent l="0" t="0" r="0" b="3810"/>
-            <wp:docPr id="2014378412" name="Picture 3"/>
+          <wp:inline distT="0" distB="0" distL="0" distR="0" wp14:anchorId="2E610642" wp14:editId="59B66019">
+            <wp:extent cx="3224981" cy="2035252"/>
+            <wp:effectExtent l="0" t="0" r="1270" b="0"/>
+            <wp:docPr id="1819741333" name="Picture 6"/>
             <wp:cNvGraphicFramePr>
               <a:graphicFrameLocks xmlns:a="http://schemas.openxmlformats.org/drawingml/2006/main" noChangeAspect="1"/>
             </wp:cNvGraphicFramePr>
@@ -703,7 +637,7 @@
               <a:graphicData uri="http://schemas.openxmlformats.org/drawingml/2006/picture">
                 <pic:pic xmlns:pic="http://schemas.openxmlformats.org/drawingml/2006/picture">
                   <pic:nvPicPr>
-                    <pic:cNvPr id="2014378412" name="Picture 2014378412"/>
+                    <pic:cNvPr id="1819741333" name="Picture 1819741333"/>
                     <pic:cNvPicPr/>
                   </pic:nvPicPr>
                   <pic:blipFill>
@@ -721,7 +655,7 @@
                   <pic:spPr>
                     <a:xfrm>
                       <a:off x="0" y="0"/>
-                      <a:ext cx="3326619" cy="2099395"/>
+                      <a:ext cx="3311183" cy="2089653"/>
                     </a:xfrm>
                     <a:prstGeom prst="rect">
                       <a:avLst/>
@@ -737,13 +671,13 @@
         <w:rPr>
           <w:rFonts w:ascii="Times New Roman" w:hAnsi="Times New Roman" w:cs="Times New Roman"/>
         </w:rPr>
-        <w:t>(</w:t>
-      </w:r>
-      <w:r>
-        <w:rPr>
-          <w:rFonts w:ascii="Times New Roman" w:hAnsi="Times New Roman" w:cs="Times New Roman"/>
-        </w:rPr>
-        <w:t>2.c contact.html)</w:t>
+        <w:t>(2.c</w:t>
+      </w:r>
+      <w:r>
+        <w:rPr>
+          <w:rFonts w:ascii="Times New Roman" w:hAnsi="Times New Roman" w:cs="Times New Roman"/>
+        </w:rPr>
+        <w:t xml:space="preserve"> contact.html)</w:t>
       </w:r>
     </w:p>
     <w:p>
@@ -815,7 +749,7 @@
     </w:p>
     <w:p>
       <w:pPr>
-        <w:spacing w:line="480" w:lineRule="auto"/>
+        <w:spacing w:line="276" w:lineRule="auto"/>
         <w:ind w:firstLine="720"/>
         <w:rPr>
           <w:rFonts w:ascii="Times New Roman" w:hAnsi="Times New Roman" w:cs="Times New Roman"/>
@@ -825,31 +759,7 @@
         <w:rPr>
           <w:rFonts w:ascii="Times New Roman" w:hAnsi="Times New Roman" w:cs="Times New Roman"/>
         </w:rPr>
-        <w:t>The index.html file was validated using the Nu HTML Checker (validator.nu). All errors</w:t>
-      </w:r>
-      <w:r>
-        <w:rPr>
-          <w:rFonts w:ascii="Times New Roman" w:hAnsi="Times New Roman" w:cs="Times New Roman"/>
-        </w:rPr>
-        <w:t xml:space="preserve"> </w:t>
-      </w:r>
-      <w:r>
-        <w:rPr>
-          <w:rFonts w:ascii="Times New Roman" w:hAnsi="Times New Roman" w:cs="Times New Roman"/>
-        </w:rPr>
-        <w:t xml:space="preserve">and warnings were identified and corrected prior to final submission. The validator returned </w:t>
-      </w:r>
-      <w:r>
-        <w:rPr>
-          <w:rFonts w:ascii="Times New Roman" w:hAnsi="Times New Roman" w:cs="Times New Roman"/>
-        </w:rPr>
-        <w:t>no errors</w:t>
-      </w:r>
-      <w:r>
-        <w:rPr>
-          <w:rFonts w:ascii="Times New Roman" w:hAnsi="Times New Roman" w:cs="Times New Roman"/>
-        </w:rPr>
-        <w:t xml:space="preserve"> on the final check.</w:t>
+        <w:t>The index.html, about.html, and contact.html files were validated using the Nu HTML Checker (validator.nu). All errors and warnings were identified and corrected prior to final submission. The validator returned no errors on the final check.</w:t>
       </w:r>
     </w:p>
     <w:p>
@@ -866,10 +776,10 @@
           <w:noProof/>
         </w:rPr>
         <w:drawing>
-          <wp:inline distT="0" distB="0" distL="0" distR="0" wp14:anchorId="4ED9E10B" wp14:editId="5BCDC6FA">
-            <wp:extent cx="3234117" cy="1897626"/>
+          <wp:inline distT="0" distB="0" distL="0" distR="0" wp14:anchorId="459DEE5A" wp14:editId="39817C79">
+            <wp:extent cx="3232713" cy="2040132"/>
             <wp:effectExtent l="0" t="0" r="0" b="0"/>
-            <wp:docPr id="195573110" name="Picture 5"/>
+            <wp:docPr id="28704606" name="Picture 8"/>
             <wp:cNvGraphicFramePr>
               <a:graphicFrameLocks xmlns:a="http://schemas.openxmlformats.org/drawingml/2006/main" noChangeAspect="1"/>
             </wp:cNvGraphicFramePr>
@@ -877,7 +787,7 @@
               <a:graphicData uri="http://schemas.openxmlformats.org/drawingml/2006/picture">
                 <pic:pic xmlns:pic="http://schemas.openxmlformats.org/drawingml/2006/picture">
                   <pic:nvPicPr>
-                    <pic:cNvPr id="195573110" name="Picture 195573110"/>
+                    <pic:cNvPr id="28704606" name="Picture 28704606"/>
                     <pic:cNvPicPr/>
                   </pic:nvPicPr>
                   <pic:blipFill>
@@ -895,7 +805,7 @@
                   <pic:spPr>
                     <a:xfrm>
                       <a:off x="0" y="0"/>
-                      <a:ext cx="3280119" cy="1924617"/>
+                      <a:ext cx="3309614" cy="2088663"/>
                     </a:xfrm>
                     <a:prstGeom prst="rect">
                       <a:avLst/>
@@ -933,10 +843,10 @@
           <w:noProof/>
         </w:rPr>
         <w:drawing>
-          <wp:inline distT="0" distB="0" distL="0" distR="0" wp14:anchorId="610AD13F" wp14:editId="1DFF0775">
-            <wp:extent cx="3275694" cy="1922022"/>
-            <wp:effectExtent l="0" t="0" r="1270" b="0"/>
-            <wp:docPr id="636398440" name="Picture 4"/>
+          <wp:inline distT="0" distB="0" distL="0" distR="0" wp14:anchorId="703B290B" wp14:editId="4C7EDA17">
+            <wp:extent cx="3217134" cy="2030300"/>
+            <wp:effectExtent l="0" t="0" r="0" b="0"/>
+            <wp:docPr id="671687501" name="Picture 9"/>
             <wp:cNvGraphicFramePr>
               <a:graphicFrameLocks xmlns:a="http://schemas.openxmlformats.org/drawingml/2006/main" noChangeAspect="1"/>
             </wp:cNvGraphicFramePr>
@@ -944,7 +854,7 @@
               <a:graphicData uri="http://schemas.openxmlformats.org/drawingml/2006/picture">
                 <pic:pic xmlns:pic="http://schemas.openxmlformats.org/drawingml/2006/picture">
                   <pic:nvPicPr>
-                    <pic:cNvPr id="636398440" name="Picture 636398440"/>
+                    <pic:cNvPr id="671687501" name="Picture 671687501"/>
                     <pic:cNvPicPr/>
                   </pic:nvPicPr>
                   <pic:blipFill>
@@ -962,7 +872,7 @@
                   <pic:spPr>
                     <a:xfrm>
                       <a:off x="0" y="0"/>
-                      <a:ext cx="3306069" cy="1939845"/>
+                      <a:ext cx="3294614" cy="2079197"/>
                     </a:xfrm>
                     <a:prstGeom prst="rect">
                       <a:avLst/>
@@ -980,25 +890,16 @@
         </w:rPr>
         <w:t>(3.b about.html)</w:t>
       </w:r>
-    </w:p>
-    <w:p>
-      <w:pPr>
-        <w:spacing w:line="276" w:lineRule="auto"/>
-        <w:jc w:val="center"/>
-        <w:rPr>
-          <w:rFonts w:ascii="Times New Roman" w:hAnsi="Times New Roman" w:cs="Times New Roman"/>
-        </w:rPr>
-      </w:pPr>
       <w:r>
         <w:rPr>
           <w:rFonts w:ascii="Times New Roman" w:hAnsi="Times New Roman" w:cs="Times New Roman"/>
           <w:noProof/>
         </w:rPr>
         <w:drawing>
-          <wp:inline distT="0" distB="0" distL="0" distR="0" wp14:anchorId="3EB8342C" wp14:editId="439FD31F">
-            <wp:extent cx="3274142" cy="1921110"/>
-            <wp:effectExtent l="0" t="0" r="2540" b="0"/>
-            <wp:docPr id="489382414" name="Picture 6"/>
+          <wp:inline distT="0" distB="0" distL="0" distR="0" wp14:anchorId="6EEE72DF" wp14:editId="04A86D89">
+            <wp:extent cx="3239729" cy="2044560"/>
+            <wp:effectExtent l="0" t="0" r="0" b="0"/>
+            <wp:docPr id="1480546348" name="Picture 10"/>
             <wp:cNvGraphicFramePr>
               <a:graphicFrameLocks xmlns:a="http://schemas.openxmlformats.org/drawingml/2006/main" noChangeAspect="1"/>
             </wp:cNvGraphicFramePr>
@@ -1006,7 +907,7 @@
               <a:graphicData uri="http://schemas.openxmlformats.org/drawingml/2006/picture">
                 <pic:pic xmlns:pic="http://schemas.openxmlformats.org/drawingml/2006/picture">
                   <pic:nvPicPr>
-                    <pic:cNvPr id="489382414" name="Picture 489382414"/>
+                    <pic:cNvPr id="1480546348" name="Picture 1480546348"/>
                     <pic:cNvPicPr/>
                   </pic:nvPicPr>
                   <pic:blipFill>
@@ -1024,7 +925,7 @@
                   <pic:spPr>
                     <a:xfrm>
                       <a:off x="0" y="0"/>
-                      <a:ext cx="3332520" cy="1955363"/>
+                      <a:ext cx="3317570" cy="2093685"/>
                     </a:xfrm>
                     <a:prstGeom prst="rect">
                       <a:avLst/>
@@ -1088,9 +989,140 @@
         <w:t xml:space="preserve"> in the web page(s)</w:t>
       </w:r>
     </w:p>
+    <w:p>
+      <w:pPr>
+        <w:spacing w:line="480" w:lineRule="auto"/>
+        <w:rPr>
+          <w:rFonts w:ascii="Times New Roman" w:hAnsi="Times New Roman" w:cs="Times New Roman"/>
+        </w:rPr>
+      </w:pPr>
+      <w:r>
+        <w:rPr>
+          <w:rFonts w:ascii="Times New Roman" w:hAnsi="Times New Roman" w:cs="Times New Roman"/>
+        </w:rPr>
+        <w:t>CSS Validation</w:t>
+      </w:r>
+    </w:p>
+    <w:p>
+      <w:pPr>
+        <w:spacing w:line="480" w:lineRule="auto"/>
+        <w:ind w:firstLine="720"/>
+        <w:rPr>
+          <w:rFonts w:ascii="Times New Roman" w:hAnsi="Times New Roman" w:cs="Times New Roman"/>
+        </w:rPr>
+      </w:pPr>
+      <w:r>
+        <w:rPr>
+          <w:rFonts w:ascii="Times New Roman" w:hAnsi="Times New Roman" w:cs="Times New Roman"/>
+        </w:rPr>
+        <w:lastRenderedPageBreak/>
+        <w:t>The styles.css file was validated using the W3C CSS Validation Service (jigsaw.w3.org). The validator returned no errors on the final check. One warning was present: “Imported style sheets are not checked in direct input and file upload modes.” This is expected behavior when using @import for Google Fonts and does not indicate an error in the stylesheet.</w:t>
+      </w:r>
+    </w:p>
+    <w:p>
+      <w:pPr>
+        <w:spacing w:line="480" w:lineRule="auto"/>
+        <w:jc w:val="center"/>
+        <w:rPr>
+          <w:rFonts w:ascii="Times New Roman" w:hAnsi="Times New Roman" w:cs="Times New Roman"/>
+        </w:rPr>
+      </w:pPr>
+      <w:r>
+        <w:rPr>
+          <w:rFonts w:ascii="Times New Roman" w:hAnsi="Times New Roman" w:cs="Times New Roman"/>
+          <w:noProof/>
+        </w:rPr>
+        <w:drawing>
+          <wp:inline distT="0" distB="0" distL="0" distR="0" wp14:anchorId="627BEC38" wp14:editId="62107405">
+            <wp:extent cx="3657600" cy="2308274"/>
+            <wp:effectExtent l="0" t="0" r="0" b="0"/>
+            <wp:docPr id="1564902572" name="Picture 7"/>
+            <wp:cNvGraphicFramePr>
+              <a:graphicFrameLocks xmlns:a="http://schemas.openxmlformats.org/drawingml/2006/main" noChangeAspect="1"/>
+            </wp:cNvGraphicFramePr>
+            <a:graphic xmlns:a="http://schemas.openxmlformats.org/drawingml/2006/main">
+              <a:graphicData uri="http://schemas.openxmlformats.org/drawingml/2006/picture">
+                <pic:pic xmlns:pic="http://schemas.openxmlformats.org/drawingml/2006/picture">
+                  <pic:nvPicPr>
+                    <pic:cNvPr id="1564902572" name="Picture 1564902572"/>
+                    <pic:cNvPicPr/>
+                  </pic:nvPicPr>
+                  <pic:blipFill>
+                    <a:blip r:embed="rId15" cstate="print">
+                      <a:extLst>
+                        <a:ext uri="{28A0092B-C50C-407E-A947-70E740481C1C}">
+                          <a14:useLocalDpi xmlns:a14="http://schemas.microsoft.com/office/drawing/2010/main" val="0"/>
+                        </a:ext>
+                      </a:extLst>
+                    </a:blip>
+                    <a:stretch>
+                      <a:fillRect/>
+                    </a:stretch>
+                  </pic:blipFill>
+                  <pic:spPr>
+                    <a:xfrm>
+                      <a:off x="0" y="0"/>
+                      <a:ext cx="3728138" cy="2352790"/>
+                    </a:xfrm>
+                    <a:prstGeom prst="rect">
+                      <a:avLst/>
+                    </a:prstGeom>
+                  </pic:spPr>
+                </pic:pic>
+              </a:graphicData>
+            </a:graphic>
+          </wp:inline>
+        </w:drawing>
+      </w:r>
+    </w:p>
+    <w:p>
+      <w:pPr>
+        <w:spacing w:line="480" w:lineRule="auto"/>
+        <w:jc w:val="center"/>
+        <w:rPr>
+          <w:rFonts w:ascii="Times New Roman" w:hAnsi="Times New Roman" w:cs="Times New Roman"/>
+        </w:rPr>
+      </w:pPr>
+      <w:r>
+        <w:rPr>
+          <w:rFonts w:ascii="Times New Roman" w:hAnsi="Times New Roman" w:cs="Times New Roman"/>
+        </w:rPr>
+        <w:t xml:space="preserve">Figure </w:t>
+      </w:r>
+      <w:r>
+        <w:rPr>
+          <w:rFonts w:ascii="Times New Roman" w:hAnsi="Times New Roman" w:cs="Times New Roman"/>
+        </w:rPr>
+        <w:t>4</w:t>
+      </w:r>
+      <w:r>
+        <w:rPr>
+          <w:rFonts w:ascii="Times New Roman" w:hAnsi="Times New Roman" w:cs="Times New Roman"/>
+        </w:rPr>
+        <w:t>.</w:t>
+      </w:r>
+      <w:r>
+        <w:rPr>
+          <w:rFonts w:ascii="Times New Roman" w:hAnsi="Times New Roman" w:cs="Times New Roman"/>
+        </w:rPr>
+        <w:t xml:space="preserve"> styles.css </w:t>
+      </w:r>
+      <w:r>
+        <w:rPr>
+          <w:rFonts w:ascii="Times New Roman" w:hAnsi="Times New Roman" w:cs="Times New Roman"/>
+        </w:rPr>
+        <w:t xml:space="preserve">validated </w:t>
+      </w:r>
+      <w:r>
+        <w:rPr>
+          <w:rFonts w:ascii="Times New Roman" w:hAnsi="Times New Roman" w:cs="Times New Roman"/>
+        </w:rPr>
+        <w:t>in w3</w:t>
+      </w:r>
+    </w:p>
     <w:sectPr>
-      <w:headerReference w:type="even" r:id="rId15"/>
-      <w:headerReference w:type="default" r:id="rId16"/>
+      <w:headerReference w:type="even" r:id="rId16"/>
+      <w:headerReference w:type="default" r:id="rId17"/>
       <w:pgSz w:w="12240" w:h="15840"/>
       <w:pgMar w:top="1440" w:right="1440" w:bottom="1440" w:left="1440" w:header="720" w:footer="720" w:gutter="0"/>
       <w:cols w:space="720"/>

</xml_diff>